<commit_message>
notif docs: completed validation tools person view improved refactoring with processing docs inbox - added excel and archive buttons
</commit_message>
<xml_diff>
--- a/resources/templates/support-form/Мико.docx
+++ b/resources/templates/support-form/Мико.docx
@@ -33,7 +33,39 @@
         <w:jc w:val="both"/>
       </w:pPr>
       <w:r>
-        <w:t>{%p for doc in documents %}</w:t>
+        <w:t xml:space="preserve">{%p </w:t>
+      </w:r>
+      <w:proofErr w:type="spellStart"/>
+      <w:r>
+        <w:t>for</w:t>
+      </w:r>
+      <w:proofErr w:type="spellEnd"/>
+      <w:r>
+        <w:t xml:space="preserve"> </w:t>
+      </w:r>
+      <w:proofErr w:type="spellStart"/>
+      <w:r>
+        <w:t>doc</w:t>
+      </w:r>
+      <w:proofErr w:type="spellEnd"/>
+      <w:r>
+        <w:t xml:space="preserve"> </w:t>
+      </w:r>
+      <w:proofErr w:type="spellStart"/>
+      <w:r>
+        <w:t>in</w:t>
+      </w:r>
+      <w:proofErr w:type="spellEnd"/>
+      <w:r>
+        <w:t xml:space="preserve"> </w:t>
+      </w:r>
+      <w:proofErr w:type="spellStart"/>
+      <w:r>
+        <w:t>documents</w:t>
+      </w:r>
+      <w:proofErr w:type="spellEnd"/>
+      <w:r>
+        <w:t xml:space="preserve"> %}</w:t>
       </w:r>
     </w:p>
     <w:tbl>
@@ -965,9 +997,38 @@
         <w:rPr>
           <w:rFonts w:ascii="Times New Roman" w:hAnsi="Times New Roman"/>
           <w:noProof/>
+        </w:rPr>
+        <w:t>{{</w:t>
+      </w:r>
+      <w:r>
+        <w:rPr>
+          <w:rFonts w:ascii="Times New Roman" w:hAnsi="Times New Roman"/>
+          <w:noProof/>
           <w:lang w:val="en-US"/>
         </w:rPr>
-        <w:t>{{doc.TITLE}}</w:t>
+        <w:t>doc</w:t>
+      </w:r>
+      <w:r>
+        <w:rPr>
+          <w:rFonts w:ascii="Times New Roman" w:hAnsi="Times New Roman"/>
+          <w:noProof/>
+        </w:rPr>
+        <w:t>.</w:t>
+      </w:r>
+      <w:r>
+        <w:rPr>
+          <w:rFonts w:ascii="Times New Roman" w:hAnsi="Times New Roman"/>
+          <w:noProof/>
+          <w:lang w:val="en-US"/>
+        </w:rPr>
+        <w:t>TITLE</w:t>
+      </w:r>
+      <w:r>
+        <w:rPr>
+          <w:rFonts w:ascii="Times New Roman" w:hAnsi="Times New Roman"/>
+          <w:noProof/>
+        </w:rPr>
+        <w:t>}}</w:t>
       </w:r>
       <w:r>
         <w:rPr>
@@ -2371,20 +2432,6 @@
           <w:lang w:val="en-GB"/>
         </w:rPr>
       </w:pPr>
-    </w:p>
-    <w:p>
-      <w:pPr>
-        <w:pStyle w:val="NoSpacing"/>
-        <w:tabs>
-          <w:tab w:val="left" w:pos="5387"/>
-        </w:tabs>
-        <w:ind w:right="-2"/>
-        <w:jc w:val="both"/>
-        <w:rPr>
-          <w:noProof/>
-          <w:lang w:val="en-GB"/>
-        </w:rPr>
-      </w:pPr>
       <w:r>
         <w:rPr>
           <w:b/>
@@ -2392,6 +2439,7 @@
           <w:noProof/>
           <w:lang w:val="en-GB"/>
         </w:rPr>
+        <w:lastRenderedPageBreak/>
         <w:t>{%p endif %}</w:t>
       </w:r>
       <w:r>

</xml_diff>